<commit_message>
Perbaikan format Word: tabel rapi (kolom proporsional, cell padding, header berwarna), kerangka pikir sebagai flowchart vertikal center
</commit_message>
<xml_diff>
--- a/SINOPSIS_TESIS_S2.docx
+++ b/SINOPSIS_TESIS_S2.docx
@@ -251,11 +251,6 @@
       </w:r>
     </w:p>
     <w:p>
-      <w:pPr>
-        <w:spacing w:before="0" w:after="0" w:line="240" w:lineRule="auto"/>
-      </w:pPr>
-    </w:p>
-    <w:p>
       <w:r>
         <w:rPr>
           <w:b/>
@@ -373,29 +368,41 @@
     <w:tbl>
       <w:tblPr>
         <w:tblW w:w="9072" w:type="dxa"/>
+        <w:tblInd w:w="0" w:type="dxa"/>
         <w:tblBorders>
-          <w:top w:val="single" w:sz="4" w:space="0" w:color="000000"/>
-          <w:left w:val="single" w:sz="4" w:space="0" w:color="000000"/>
-          <w:bottom w:val="single" w:sz="4" w:space="0" w:color="000000"/>
-          <w:right w:val="single" w:sz="4" w:space="0" w:color="000000"/>
-          <w:insideH w:val="single" w:sz="4" w:space="0" w:color="000000"/>
-          <w:insideV w:val="single" w:sz="4" w:space="0" w:color="000000"/>
+          <w:top w:val="single" w:sz="6" w:space="0" w:color="000000"/>
+          <w:left w:val="single" w:sz="6" w:space="0" w:color="000000"/>
+          <w:bottom w:val="single" w:sz="6" w:space="0" w:color="000000"/>
+          <w:right w:val="single" w:sz="6" w:space="0" w:color="000000"/>
+          <w:insideH w:val="single" w:sz="6" w:space="0" w:color="000000"/>
+          <w:insideV w:val="single" w:sz="6" w:space="0" w:color="000000"/>
         </w:tblBorders>
-        <w:tblLayout w:type="fixed"/>
+        <w:tblCellMar>
+          <w:top w:w="60" w:type="dxa"/>
+          <w:left w:w="108" w:type="dxa"/>
+          <w:bottom w:w="60" w:type="dxa"/>
+          <w:right w:w="108" w:type="dxa"/>
+        </w:tblCellMar>
       </w:tblPr>
       <w:tblGrid>
-        <w:gridCol w:w="600"/>
-        <w:gridCol w:w="2800"/>
-        <w:gridCol w:w="5672"/>
+        <w:gridCol w:w="700"/>
+        <w:gridCol w:w="3100"/>
+        <w:gridCol w:w="5272"/>
       </w:tblGrid>
       <w:tr>
-        <w:tc>
-          <w:tcPr>
-            <w:tcW w:w="600" w:type="dxa"/>
-          </w:tcPr>
-          <w:p>
-            <w:pPr>
-              <w:spacing w:after="60" w:line="240" w:lineRule="auto"/>
+        <w:trPr>
+          <w:cantSplit/>
+        </w:trPr>
+        <w:tc>
+          <w:tcPr>
+            <w:tcW w:w="700" w:type="dxa"/>
+            <w:vAlign w:val="center"/>
+            <w:shd w:val="clear" w:color="auto" w:fill="D9E2F3"/>
+          </w:tcPr>
+          <w:p>
+            <w:pPr>
+              <w:spacing w:before="40" w:after="40" w:line="240" w:lineRule="auto"/>
+              <w:jc w:val="center"/>
             </w:pPr>
             <w:r>
               <w:rPr>
@@ -407,11 +414,14 @@
         </w:tc>
         <w:tc>
           <w:tcPr>
-            <w:tcW w:w="2800" w:type="dxa"/>
-          </w:tcPr>
-          <w:p>
-            <w:pPr>
-              <w:spacing w:after="60" w:line="240" w:lineRule="auto"/>
+            <w:tcW w:w="3100" w:type="dxa"/>
+            <w:vAlign w:val="center"/>
+            <w:shd w:val="clear" w:color="auto" w:fill="D9E2F3"/>
+          </w:tcPr>
+          <w:p>
+            <w:pPr>
+              <w:spacing w:before="40" w:after="40" w:line="240" w:lineRule="auto"/>
+              <w:jc w:val="center"/>
             </w:pPr>
             <w:r>
               <w:rPr>
@@ -423,11 +433,14 @@
         </w:tc>
         <w:tc>
           <w:tcPr>
-            <w:tcW w:w="5672" w:type="dxa"/>
-          </w:tcPr>
-          <w:p>
-            <w:pPr>
-              <w:spacing w:after="60" w:line="240" w:lineRule="auto"/>
+            <w:tcW w:w="5272" w:type="dxa"/>
+            <w:vAlign w:val="center"/>
+            <w:shd w:val="clear" w:color="auto" w:fill="D9E2F3"/>
+          </w:tcPr>
+          <w:p>
+            <w:pPr>
+              <w:spacing w:before="40" w:after="40" w:line="240" w:lineRule="auto"/>
+              <w:jc w:val="center"/>
             </w:pPr>
             <w:r>
               <w:rPr>
@@ -439,13 +452,18 @@
         </w:tc>
       </w:tr>
       <w:tr>
-        <w:tc>
-          <w:tcPr>
-            <w:tcW w:w="600" w:type="dxa"/>
-          </w:tcPr>
-          <w:p>
-            <w:pPr>
-              <w:spacing w:after="60" w:line="240" w:lineRule="auto"/>
+        <w:trPr>
+          <w:cantSplit/>
+        </w:trPr>
+        <w:tc>
+          <w:tcPr>
+            <w:tcW w:w="700" w:type="dxa"/>
+            <w:vAlign w:val="center"/>
+          </w:tcPr>
+          <w:p>
+            <w:pPr>
+              <w:spacing w:before="40" w:after="40" w:line="240" w:lineRule="auto"/>
+              <w:jc w:val="center"/>
             </w:pPr>
             <w:r>
               <w:t xml:space="preserve">1</w:t>
@@ -454,11 +472,13 @@
         </w:tc>
         <w:tc>
           <w:tcPr>
-            <w:tcW w:w="2800" w:type="dxa"/>
-          </w:tcPr>
-          <w:p>
-            <w:pPr>
-              <w:spacing w:after="60" w:line="240" w:lineRule="auto"/>
+            <w:tcW w:w="3100" w:type="dxa"/>
+            <w:vAlign w:val="center"/>
+          </w:tcPr>
+          <w:p>
+            <w:pPr>
+              <w:spacing w:before="40" w:after="40" w:line="240" w:lineRule="auto"/>
+              <w:jc w:val="left"/>
             </w:pPr>
             <w:r>
               <w:t xml:space="preserve">Data tangkapan ikan demersal</w:t>
@@ -467,11 +487,13 @@
         </w:tc>
         <w:tc>
           <w:tcPr>
-            <w:tcW w:w="5672" w:type="dxa"/>
-          </w:tcPr>
-          <w:p>
-            <w:pPr>
-              <w:spacing w:after="60" w:line="240" w:lineRule="auto"/>
+            <w:tcW w:w="5272" w:type="dxa"/>
+            <w:vAlign w:val="center"/>
+          </w:tcPr>
+          <w:p>
+            <w:pPr>
+              <w:spacing w:before="40" w:after="40" w:line="240" w:lineRule="auto"/>
+              <w:jc w:val="left"/>
             </w:pPr>
             <w:r>
               <w:t xml:space="preserve">Hasil tangkapan sondong dan bottom gill net pada Musim Timur dan Musim Peralihan</w:t>
@@ -480,13 +502,18 @@
         </w:tc>
       </w:tr>
       <w:tr>
-        <w:tc>
-          <w:tcPr>
-            <w:tcW w:w="600" w:type="dxa"/>
-          </w:tcPr>
-          <w:p>
-            <w:pPr>
-              <w:spacing w:after="60" w:line="240" w:lineRule="auto"/>
+        <w:trPr>
+          <w:cantSplit/>
+        </w:trPr>
+        <w:tc>
+          <w:tcPr>
+            <w:tcW w:w="700" w:type="dxa"/>
+            <w:vAlign w:val="center"/>
+          </w:tcPr>
+          <w:p>
+            <w:pPr>
+              <w:spacing w:before="40" w:after="40" w:line="240" w:lineRule="auto"/>
+              <w:jc w:val="center"/>
             </w:pPr>
             <w:r>
               <w:t xml:space="preserve">2</w:t>
@@ -495,11 +522,13 @@
         </w:tc>
         <w:tc>
           <w:tcPr>
-            <w:tcW w:w="2800" w:type="dxa"/>
-          </w:tcPr>
-          <w:p>
-            <w:pPr>
-              <w:spacing w:after="60" w:line="240" w:lineRule="auto"/>
+            <w:tcW w:w="3100" w:type="dxa"/>
+            <w:vAlign w:val="center"/>
+          </w:tcPr>
+          <w:p>
+            <w:pPr>
+              <w:spacing w:before="40" w:after="40" w:line="240" w:lineRule="auto"/>
+              <w:jc w:val="left"/>
             </w:pPr>
             <w:r>
               <w:t xml:space="preserve">Sampel sedimen dasar perairan</w:t>
@@ -508,11 +537,13 @@
         </w:tc>
         <w:tc>
           <w:tcPr>
-            <w:tcW w:w="5672" w:type="dxa"/>
-          </w:tcPr>
-          <w:p>
-            <w:pPr>
-              <w:spacing w:after="60" w:line="240" w:lineRule="auto"/>
+            <w:tcW w:w="5272" w:type="dxa"/>
+            <w:vAlign w:val="center"/>
+          </w:tcPr>
+          <w:p>
+            <w:pPr>
+              <w:spacing w:before="40" w:after="40" w:line="240" w:lineRule="auto"/>
+              <w:jc w:val="left"/>
             </w:pPr>
             <w:r>
               <w:t xml:space="preserve">Diambil dari titik-titik fishing ground aktif</w:t>
@@ -521,13 +552,18 @@
         </w:tc>
       </w:tr>
       <w:tr>
-        <w:tc>
-          <w:tcPr>
-            <w:tcW w:w="600" w:type="dxa"/>
-          </w:tcPr>
-          <w:p>
-            <w:pPr>
-              <w:spacing w:after="60" w:line="240" w:lineRule="auto"/>
+        <w:trPr>
+          <w:cantSplit/>
+        </w:trPr>
+        <w:tc>
+          <w:tcPr>
+            <w:tcW w:w="700" w:type="dxa"/>
+            <w:vAlign w:val="center"/>
+          </w:tcPr>
+          <w:p>
+            <w:pPr>
+              <w:spacing w:before="40" w:after="40" w:line="240" w:lineRule="auto"/>
+              <w:jc w:val="center"/>
             </w:pPr>
             <w:r>
               <w:t xml:space="preserve">3</w:t>
@@ -536,11 +572,13 @@
         </w:tc>
         <w:tc>
           <w:tcPr>
-            <w:tcW w:w="2800" w:type="dxa"/>
-          </w:tcPr>
-          <w:p>
-            <w:pPr>
-              <w:spacing w:after="60" w:line="240" w:lineRule="auto"/>
+            <w:tcW w:w="3100" w:type="dxa"/>
+            <w:vAlign w:val="center"/>
+          </w:tcPr>
+          <w:p>
+            <w:pPr>
+              <w:spacing w:before="40" w:after="40" w:line="240" w:lineRule="auto"/>
+              <w:jc w:val="left"/>
             </w:pPr>
             <w:r>
               <w:t xml:space="preserve">Data batimetri</w:t>
@@ -549,11 +587,13 @@
         </w:tc>
         <w:tc>
           <w:tcPr>
-            <w:tcW w:w="5672" w:type="dxa"/>
-          </w:tcPr>
-          <w:p>
-            <w:pPr>
-              <w:spacing w:after="60" w:line="240" w:lineRule="auto"/>
+            <w:tcW w:w="5272" w:type="dxa"/>
+            <w:vAlign w:val="center"/>
+          </w:tcPr>
+          <w:p>
+            <w:pPr>
+              <w:spacing w:before="40" w:after="40" w:line="240" w:lineRule="auto"/>
+              <w:jc w:val="left"/>
             </w:pPr>
             <w:r>
               <w:t xml:space="preserve">Kedalaman perairan pada area penangkapan</w:t>
@@ -562,13 +602,18 @@
         </w:tc>
       </w:tr>
       <w:tr>
-        <w:tc>
-          <w:tcPr>
-            <w:tcW w:w="600" w:type="dxa"/>
-          </w:tcPr>
-          <w:p>
-            <w:pPr>
-              <w:spacing w:after="60" w:line="240" w:lineRule="auto"/>
+        <w:trPr>
+          <w:cantSplit/>
+        </w:trPr>
+        <w:tc>
+          <w:tcPr>
+            <w:tcW w:w="700" w:type="dxa"/>
+            <w:vAlign w:val="center"/>
+          </w:tcPr>
+          <w:p>
+            <w:pPr>
+              <w:spacing w:before="40" w:after="40" w:line="240" w:lineRule="auto"/>
+              <w:jc w:val="center"/>
             </w:pPr>
             <w:r>
               <w:t xml:space="preserve">4</w:t>
@@ -577,11 +622,13 @@
         </w:tc>
         <w:tc>
           <w:tcPr>
-            <w:tcW w:w="2800" w:type="dxa"/>
-          </w:tcPr>
-          <w:p>
-            <w:pPr>
-              <w:spacing w:after="60" w:line="240" w:lineRule="auto"/>
+            <w:tcW w:w="3100" w:type="dxa"/>
+            <w:vAlign w:val="center"/>
+          </w:tcPr>
+          <w:p>
+            <w:pPr>
+              <w:spacing w:before="40" w:after="40" w:line="240" w:lineRule="auto"/>
+              <w:jc w:val="left"/>
             </w:pPr>
             <w:r>
               <w:t xml:space="preserve">Sampel bahan organik</w:t>
@@ -590,11 +637,13 @@
         </w:tc>
         <w:tc>
           <w:tcPr>
-            <w:tcW w:w="5672" w:type="dxa"/>
-          </w:tcPr>
-          <w:p>
-            <w:pPr>
-              <w:spacing w:after="60" w:line="240" w:lineRule="auto"/>
+            <w:tcW w:w="5272" w:type="dxa"/>
+            <w:vAlign w:val="center"/>
+          </w:tcPr>
+          <w:p>
+            <w:pPr>
+              <w:spacing w:before="40" w:after="40" w:line="240" w:lineRule="auto"/>
+              <w:jc w:val="left"/>
             </w:pPr>
             <w:r>
               <w:t xml:space="preserve">Kandungan organik dalam sedimen</w:t>
@@ -603,13 +652,18 @@
         </w:tc>
       </w:tr>
       <w:tr>
-        <w:tc>
-          <w:tcPr>
-            <w:tcW w:w="600" w:type="dxa"/>
-          </w:tcPr>
-          <w:p>
-            <w:pPr>
-              <w:spacing w:after="60" w:line="240" w:lineRule="auto"/>
+        <w:trPr>
+          <w:cantSplit/>
+        </w:trPr>
+        <w:tc>
+          <w:tcPr>
+            <w:tcW w:w="700" w:type="dxa"/>
+            <w:vAlign w:val="center"/>
+          </w:tcPr>
+          <w:p>
+            <w:pPr>
+              <w:spacing w:before="40" w:after="40" w:line="240" w:lineRule="auto"/>
+              <w:jc w:val="center"/>
             </w:pPr>
             <w:r>
               <w:t xml:space="preserve">5</w:t>
@@ -618,11 +672,13 @@
         </w:tc>
         <w:tc>
           <w:tcPr>
-            <w:tcW w:w="2800" w:type="dxa"/>
-          </w:tcPr>
-          <w:p>
-            <w:pPr>
-              <w:spacing w:after="60" w:line="240" w:lineRule="auto"/>
+            <w:tcW w:w="3100" w:type="dxa"/>
+            <w:vAlign w:val="center"/>
+          </w:tcPr>
+          <w:p>
+            <w:pPr>
+              <w:spacing w:before="40" w:after="40" w:line="240" w:lineRule="auto"/>
+              <w:jc w:val="left"/>
             </w:pPr>
             <w:r>
               <w:t xml:space="preserve">Sampel makroplastik</w:t>
@@ -631,11 +687,13 @@
         </w:tc>
         <w:tc>
           <w:tcPr>
-            <w:tcW w:w="5672" w:type="dxa"/>
-          </w:tcPr>
-          <w:p>
-            <w:pPr>
-              <w:spacing w:after="60" w:line="240" w:lineRule="auto"/>
+            <w:tcW w:w="5272" w:type="dxa"/>
+            <w:vAlign w:val="center"/>
+          </w:tcPr>
+          <w:p>
+            <w:pPr>
+              <w:spacing w:before="40" w:after="40" w:line="240" w:lineRule="auto"/>
+              <w:jc w:val="left"/>
             </w:pPr>
             <w:r>
               <w:t xml:space="preserve">Sampah plastik makro di area penelitian</w:t>
@@ -644,13 +702,18 @@
         </w:tc>
       </w:tr>
       <w:tr>
-        <w:tc>
-          <w:tcPr>
-            <w:tcW w:w="600" w:type="dxa"/>
-          </w:tcPr>
-          <w:p>
-            <w:pPr>
-              <w:spacing w:after="60" w:line="240" w:lineRule="auto"/>
+        <w:trPr>
+          <w:cantSplit/>
+        </w:trPr>
+        <w:tc>
+          <w:tcPr>
+            <w:tcW w:w="700" w:type="dxa"/>
+            <w:vAlign w:val="center"/>
+          </w:tcPr>
+          <w:p>
+            <w:pPr>
+              <w:spacing w:before="40" w:after="40" w:line="240" w:lineRule="auto"/>
+              <w:jc w:val="center"/>
             </w:pPr>
             <w:r>
               <w:t xml:space="preserve">6</w:t>
@@ -659,11 +722,13 @@
         </w:tc>
         <w:tc>
           <w:tcPr>
-            <w:tcW w:w="2800" w:type="dxa"/>
-          </w:tcPr>
-          <w:p>
-            <w:pPr>
-              <w:spacing w:after="60" w:line="240" w:lineRule="auto"/>
+            <w:tcW w:w="3100" w:type="dxa"/>
+            <w:vAlign w:val="center"/>
+          </w:tcPr>
+          <w:p>
+            <w:pPr>
+              <w:spacing w:before="40" w:after="40" w:line="240" w:lineRule="auto"/>
+              <w:jc w:val="left"/>
             </w:pPr>
             <w:r>
               <w:t xml:space="preserve">Sampel mikroplastik</w:t>
@@ -672,11 +737,13 @@
         </w:tc>
         <w:tc>
           <w:tcPr>
-            <w:tcW w:w="5672" w:type="dxa"/>
-          </w:tcPr>
-          <w:p>
-            <w:pPr>
-              <w:spacing w:after="60" w:line="240" w:lineRule="auto"/>
+            <w:tcW w:w="5272" w:type="dxa"/>
+            <w:vAlign w:val="center"/>
+          </w:tcPr>
+          <w:p>
+            <w:pPr>
+              <w:spacing w:before="40" w:after="40" w:line="240" w:lineRule="auto"/>
+              <w:jc w:val="left"/>
             </w:pPr>
             <w:r>
               <w:t xml:space="preserve">Dari sedimen dan isi perut ikan demersal</w:t>
@@ -685,13 +752,18 @@
         </w:tc>
       </w:tr>
       <w:tr>
-        <w:tc>
-          <w:tcPr>
-            <w:tcW w:w="600" w:type="dxa"/>
-          </w:tcPr>
-          <w:p>
-            <w:pPr>
-              <w:spacing w:after="60" w:line="240" w:lineRule="auto"/>
+        <w:trPr>
+          <w:cantSplit/>
+        </w:trPr>
+        <w:tc>
+          <w:tcPr>
+            <w:tcW w:w="700" w:type="dxa"/>
+            <w:vAlign w:val="center"/>
+          </w:tcPr>
+          <w:p>
+            <w:pPr>
+              <w:spacing w:before="40" w:after="40" w:line="240" w:lineRule="auto"/>
+              <w:jc w:val="center"/>
             </w:pPr>
             <w:r>
               <w:t xml:space="preserve">7</w:t>
@@ -700,11 +772,13 @@
         </w:tc>
         <w:tc>
           <w:tcPr>
-            <w:tcW w:w="2800" w:type="dxa"/>
-          </w:tcPr>
-          <w:p>
-            <w:pPr>
-              <w:spacing w:after="60" w:line="240" w:lineRule="auto"/>
+            <w:tcW w:w="3100" w:type="dxa"/>
+            <w:vAlign w:val="center"/>
+          </w:tcPr>
+          <w:p>
+            <w:pPr>
+              <w:spacing w:before="40" w:after="40" w:line="240" w:lineRule="auto"/>
+              <w:jc w:val="left"/>
             </w:pPr>
             <w:r>
               <w:t xml:space="preserve">Data musim penangkapan</w:t>
@@ -713,11 +787,13 @@
         </w:tc>
         <w:tc>
           <w:tcPr>
-            <w:tcW w:w="5672" w:type="dxa"/>
-          </w:tcPr>
-          <w:p>
-            <w:pPr>
-              <w:spacing w:after="60" w:line="240" w:lineRule="auto"/>
+            <w:tcW w:w="5272" w:type="dxa"/>
+            <w:vAlign w:val="center"/>
+          </w:tcPr>
+          <w:p>
+            <w:pPr>
+              <w:spacing w:before="40" w:after="40" w:line="240" w:lineRule="auto"/>
+              <w:jc w:val="left"/>
             </w:pPr>
             <w:r>
               <w:t xml:space="preserve">Perbandingan Musim Timur dan Musim Peralihan</w:t>
@@ -726,13 +802,18 @@
         </w:tc>
       </w:tr>
       <w:tr>
-        <w:tc>
-          <w:tcPr>
-            <w:tcW w:w="600" w:type="dxa"/>
-          </w:tcPr>
-          <w:p>
-            <w:pPr>
-              <w:spacing w:after="60" w:line="240" w:lineRule="auto"/>
+        <w:trPr>
+          <w:cantSplit/>
+        </w:trPr>
+        <w:tc>
+          <w:tcPr>
+            <w:tcW w:w="700" w:type="dxa"/>
+            <w:vAlign w:val="center"/>
+          </w:tcPr>
+          <w:p>
+            <w:pPr>
+              <w:spacing w:before="40" w:after="40" w:line="240" w:lineRule="auto"/>
+              <w:jc w:val="center"/>
             </w:pPr>
             <w:r>
               <w:t xml:space="preserve">8</w:t>
@@ -741,11 +822,13 @@
         </w:tc>
         <w:tc>
           <w:tcPr>
-            <w:tcW w:w="2800" w:type="dxa"/>
-          </w:tcPr>
-          <w:p>
-            <w:pPr>
-              <w:spacing w:after="60" w:line="240" w:lineRule="auto"/>
+            <w:tcW w:w="3100" w:type="dxa"/>
+            <w:vAlign w:val="center"/>
+          </w:tcPr>
+          <w:p>
+            <w:pPr>
+              <w:spacing w:before="40" w:after="40" w:line="240" w:lineRule="auto"/>
+              <w:jc w:val="left"/>
             </w:pPr>
             <w:r>
               <w:t xml:space="preserve">Standar keamanan pangan</w:t>
@@ -754,11 +837,13 @@
         </w:tc>
         <w:tc>
           <w:tcPr>
-            <w:tcW w:w="5672" w:type="dxa"/>
-          </w:tcPr>
-          <w:p>
-            <w:pPr>
-              <w:spacing w:after="60" w:line="240" w:lineRule="auto"/>
+            <w:tcW w:w="5272" w:type="dxa"/>
+            <w:vAlign w:val="center"/>
+          </w:tcPr>
+          <w:p>
+            <w:pPr>
+              <w:spacing w:before="40" w:after="40" w:line="240" w:lineRule="auto"/>
+              <w:jc w:val="left"/>
             </w:pPr>
             <w:r>
               <w:t xml:space="preserve">Regulasi BPOM dan SNI terkait kontaminan pada produk perikanan</w:t>
@@ -791,29 +876,41 @@
     <w:tbl>
       <w:tblPr>
         <w:tblW w:w="9072" w:type="dxa"/>
+        <w:tblInd w:w="0" w:type="dxa"/>
         <w:tblBorders>
-          <w:top w:val="single" w:sz="4" w:space="0" w:color="000000"/>
-          <w:left w:val="single" w:sz="4" w:space="0" w:color="000000"/>
-          <w:bottom w:val="single" w:sz="4" w:space="0" w:color="000000"/>
-          <w:right w:val="single" w:sz="4" w:space="0" w:color="000000"/>
-          <w:insideH w:val="single" w:sz="4" w:space="0" w:color="000000"/>
-          <w:insideV w:val="single" w:sz="4" w:space="0" w:color="000000"/>
+          <w:top w:val="single" w:sz="6" w:space="0" w:color="000000"/>
+          <w:left w:val="single" w:sz="6" w:space="0" w:color="000000"/>
+          <w:bottom w:val="single" w:sz="6" w:space="0" w:color="000000"/>
+          <w:right w:val="single" w:sz="6" w:space="0" w:color="000000"/>
+          <w:insideH w:val="single" w:sz="6" w:space="0" w:color="000000"/>
+          <w:insideV w:val="single" w:sz="6" w:space="0" w:color="000000"/>
         </w:tblBorders>
-        <w:tblLayout w:type="fixed"/>
+        <w:tblCellMar>
+          <w:top w:w="60" w:type="dxa"/>
+          <w:left w:w="108" w:type="dxa"/>
+          <w:bottom w:w="60" w:type="dxa"/>
+          <w:right w:w="108" w:type="dxa"/>
+        </w:tblCellMar>
       </w:tblPr>
       <w:tblGrid>
-        <w:gridCol w:w="600"/>
-        <w:gridCol w:w="3200"/>
-        <w:gridCol w:w="5272"/>
+        <w:gridCol w:w="700"/>
+        <w:gridCol w:w="3600"/>
+        <w:gridCol w:w="4772"/>
       </w:tblGrid>
       <w:tr>
-        <w:tc>
-          <w:tcPr>
-            <w:tcW w:w="600" w:type="dxa"/>
-          </w:tcPr>
-          <w:p>
-            <w:pPr>
-              <w:spacing w:after="60" w:line="240" w:lineRule="auto"/>
+        <w:trPr>
+          <w:cantSplit/>
+        </w:trPr>
+        <w:tc>
+          <w:tcPr>
+            <w:tcW w:w="700" w:type="dxa"/>
+            <w:vAlign w:val="center"/>
+            <w:shd w:val="clear" w:color="auto" w:fill="D9E2F3"/>
+          </w:tcPr>
+          <w:p>
+            <w:pPr>
+              <w:spacing w:before="40" w:after="40" w:line="240" w:lineRule="auto"/>
+              <w:jc w:val="center"/>
             </w:pPr>
             <w:r>
               <w:rPr>
@@ -825,11 +922,14 @@
         </w:tc>
         <w:tc>
           <w:tcPr>
-            <w:tcW w:w="3200" w:type="dxa"/>
-          </w:tcPr>
-          <w:p>
-            <w:pPr>
-              <w:spacing w:after="60" w:line="240" w:lineRule="auto"/>
+            <w:tcW w:w="3600" w:type="dxa"/>
+            <w:vAlign w:val="center"/>
+            <w:shd w:val="clear" w:color="auto" w:fill="D9E2F3"/>
+          </w:tcPr>
+          <w:p>
+            <w:pPr>
+              <w:spacing w:before="40" w:after="40" w:line="240" w:lineRule="auto"/>
+              <w:jc w:val="center"/>
             </w:pPr>
             <w:r>
               <w:rPr>
@@ -841,11 +941,14 @@
         </w:tc>
         <w:tc>
           <w:tcPr>
-            <w:tcW w:w="5272" w:type="dxa"/>
-          </w:tcPr>
-          <w:p>
-            <w:pPr>
-              <w:spacing w:after="60" w:line="240" w:lineRule="auto"/>
+            <w:tcW w:w="4772" w:type="dxa"/>
+            <w:vAlign w:val="center"/>
+            <w:shd w:val="clear" w:color="auto" w:fill="D9E2F3"/>
+          </w:tcPr>
+          <w:p>
+            <w:pPr>
+              <w:spacing w:before="40" w:after="40" w:line="240" w:lineRule="auto"/>
+              <w:jc w:val="center"/>
             </w:pPr>
             <w:r>
               <w:rPr>
@@ -857,13 +960,18 @@
         </w:tc>
       </w:tr>
       <w:tr>
-        <w:tc>
-          <w:tcPr>
-            <w:tcW w:w="600" w:type="dxa"/>
-          </w:tcPr>
-          <w:p>
-            <w:pPr>
-              <w:spacing w:after="60" w:line="240" w:lineRule="auto"/>
+        <w:trPr>
+          <w:cantSplit/>
+        </w:trPr>
+        <w:tc>
+          <w:tcPr>
+            <w:tcW w:w="700" w:type="dxa"/>
+            <w:vAlign w:val="center"/>
+          </w:tcPr>
+          <w:p>
+            <w:pPr>
+              <w:spacing w:before="40" w:after="40" w:line="240" w:lineRule="auto"/>
+              <w:jc w:val="center"/>
             </w:pPr>
             <w:r>
               <w:t xml:space="preserve">1</w:t>
@@ -872,11 +980,13 @@
         </w:tc>
         <w:tc>
           <w:tcPr>
-            <w:tcW w:w="3200" w:type="dxa"/>
-          </w:tcPr>
-          <w:p>
-            <w:pPr>
-              <w:spacing w:after="60" w:line="240" w:lineRule="auto"/>
+            <w:tcW w:w="3600" w:type="dxa"/>
+            <w:vAlign w:val="center"/>
+          </w:tcPr>
+          <w:p>
+            <w:pPr>
+              <w:spacing w:before="40" w:after="40" w:line="240" w:lineRule="auto"/>
+              <w:jc w:val="left"/>
             </w:pPr>
             <w:r>
               <w:t xml:space="preserve">Daftar jenis dan indeks biodiversitas ikan demersal</w:t>
@@ -885,11 +995,13 @@
         </w:tc>
         <w:tc>
           <w:tcPr>
-            <w:tcW w:w="5272" w:type="dxa"/>
-          </w:tcPr>
-          <w:p>
-            <w:pPr>
-              <w:spacing w:after="60" w:line="240" w:lineRule="auto"/>
+            <w:tcW w:w="4772" w:type="dxa"/>
+            <w:vAlign w:val="center"/>
+          </w:tcPr>
+          <w:p>
+            <w:pPr>
+              <w:spacing w:before="40" w:after="40" w:line="240" w:lineRule="auto"/>
+              <w:jc w:val="left"/>
             </w:pPr>
             <w:r>
               <w:t xml:space="preserve">Komposisi spesies beserta nilai keanekaragaman</w:t>
@@ -898,13 +1010,18 @@
         </w:tc>
       </w:tr>
       <w:tr>
-        <w:tc>
-          <w:tcPr>
-            <w:tcW w:w="600" w:type="dxa"/>
-          </w:tcPr>
-          <w:p>
-            <w:pPr>
-              <w:spacing w:after="60" w:line="240" w:lineRule="auto"/>
+        <w:trPr>
+          <w:cantSplit/>
+        </w:trPr>
+        <w:tc>
+          <w:tcPr>
+            <w:tcW w:w="700" w:type="dxa"/>
+            <w:vAlign w:val="center"/>
+          </w:tcPr>
+          <w:p>
+            <w:pPr>
+              <w:spacing w:before="40" w:after="40" w:line="240" w:lineRule="auto"/>
+              <w:jc w:val="center"/>
             </w:pPr>
             <w:r>
               <w:t xml:space="preserve">2</w:t>
@@ -913,11 +1030,13 @@
         </w:tc>
         <w:tc>
           <w:tcPr>
-            <w:tcW w:w="3200" w:type="dxa"/>
-          </w:tcPr>
-          <w:p>
-            <w:pPr>
-              <w:spacing w:after="60" w:line="240" w:lineRule="auto"/>
+            <w:tcW w:w="3600" w:type="dxa"/>
+            <w:vAlign w:val="center"/>
+          </w:tcPr>
+          <w:p>
+            <w:pPr>
+              <w:spacing w:before="40" w:after="40" w:line="240" w:lineRule="auto"/>
+              <w:jc w:val="left"/>
             </w:pPr>
             <w:r>
               <w:t xml:space="preserve">Peta sebaran fishing ground aktif</w:t>
@@ -926,11 +1045,13 @@
         </w:tc>
         <w:tc>
           <w:tcPr>
-            <w:tcW w:w="5272" w:type="dxa"/>
-          </w:tcPr>
-          <w:p>
-            <w:pPr>
-              <w:spacing w:after="60" w:line="240" w:lineRule="auto"/>
+            <w:tcW w:w="4772" w:type="dxa"/>
+            <w:vAlign w:val="center"/>
+          </w:tcPr>
+          <w:p>
+            <w:pPr>
+              <w:spacing w:before="40" w:after="40" w:line="240" w:lineRule="auto"/>
+              <w:jc w:val="left"/>
             </w:pPr>
             <w:r>
               <w:t xml:space="preserve">Berdasarkan data batimetri dan kepadatan ikan</w:t>
@@ -939,13 +1060,18 @@
         </w:tc>
       </w:tr>
       <w:tr>
-        <w:tc>
-          <w:tcPr>
-            <w:tcW w:w="600" w:type="dxa"/>
-          </w:tcPr>
-          <w:p>
-            <w:pPr>
-              <w:spacing w:after="60" w:line="240" w:lineRule="auto"/>
+        <w:trPr>
+          <w:cantSplit/>
+        </w:trPr>
+        <w:tc>
+          <w:tcPr>
+            <w:tcW w:w="700" w:type="dxa"/>
+            <w:vAlign w:val="center"/>
+          </w:tcPr>
+          <w:p>
+            <w:pPr>
+              <w:spacing w:before="40" w:after="40" w:line="240" w:lineRule="auto"/>
+              <w:jc w:val="center"/>
             </w:pPr>
             <w:r>
               <w:t xml:space="preserve">3</w:t>
@@ -954,11 +1080,13 @@
         </w:tc>
         <w:tc>
           <w:tcPr>
-            <w:tcW w:w="3200" w:type="dxa"/>
-          </w:tcPr>
-          <w:p>
-            <w:pPr>
-              <w:spacing w:after="60" w:line="240" w:lineRule="auto"/>
+            <w:tcW w:w="3600" w:type="dxa"/>
+            <w:vAlign w:val="center"/>
+          </w:tcPr>
+          <w:p>
+            <w:pPr>
+              <w:spacing w:before="40" w:after="40" w:line="240" w:lineRule="auto"/>
+              <w:jc w:val="left"/>
             </w:pPr>
             <w:r>
               <w:t xml:space="preserve">Profil sedimen dan bahan organik</w:t>
@@ -967,11 +1095,13 @@
         </w:tc>
         <w:tc>
           <w:tcPr>
-            <w:tcW w:w="5272" w:type="dxa"/>
-          </w:tcPr>
-          <w:p>
-            <w:pPr>
-              <w:spacing w:after="60" w:line="240" w:lineRule="auto"/>
+            <w:tcW w:w="4772" w:type="dxa"/>
+            <w:vAlign w:val="center"/>
+          </w:tcPr>
+          <w:p>
+            <w:pPr>
+              <w:spacing w:before="40" w:after="40" w:line="240" w:lineRule="auto"/>
+              <w:jc w:val="left"/>
             </w:pPr>
             <w:r>
               <w:t xml:space="preserve">Karakteristik substrat dasar di area penangkapan</w:t>
@@ -980,13 +1110,18 @@
         </w:tc>
       </w:tr>
       <w:tr>
-        <w:tc>
-          <w:tcPr>
-            <w:tcW w:w="600" w:type="dxa"/>
-          </w:tcPr>
-          <w:p>
-            <w:pPr>
-              <w:spacing w:after="60" w:line="240" w:lineRule="auto"/>
+        <w:trPr>
+          <w:cantSplit/>
+        </w:trPr>
+        <w:tc>
+          <w:tcPr>
+            <w:tcW w:w="700" w:type="dxa"/>
+            <w:vAlign w:val="center"/>
+          </w:tcPr>
+          <w:p>
+            <w:pPr>
+              <w:spacing w:before="40" w:after="40" w:line="240" w:lineRule="auto"/>
+              <w:jc w:val="center"/>
             </w:pPr>
             <w:r>
               <w:t xml:space="preserve">4</w:t>
@@ -995,11 +1130,13 @@
         </w:tc>
         <w:tc>
           <w:tcPr>
-            <w:tcW w:w="3200" w:type="dxa"/>
-          </w:tcPr>
-          <w:p>
-            <w:pPr>
-              <w:spacing w:after="60" w:line="240" w:lineRule="auto"/>
+            <w:tcW w:w="3600" w:type="dxa"/>
+            <w:vAlign w:val="center"/>
+          </w:tcPr>
+          <w:p>
+            <w:pPr>
+              <w:spacing w:before="40" w:after="40" w:line="240" w:lineRule="auto"/>
+              <w:jc w:val="left"/>
             </w:pPr>
             <w:r>
               <w:t xml:space="preserve">Tingkat kontaminasi mikroplastik</w:t>
@@ -1008,11 +1145,13 @@
         </w:tc>
         <w:tc>
           <w:tcPr>
-            <w:tcW w:w="5272" w:type="dxa"/>
-          </w:tcPr>
-          <w:p>
-            <w:pPr>
-              <w:spacing w:after="60" w:line="240" w:lineRule="auto"/>
+            <w:tcW w:w="4772" w:type="dxa"/>
+            <w:vAlign w:val="center"/>
+          </w:tcPr>
+          <w:p>
+            <w:pPr>
+              <w:spacing w:before="40" w:after="40" w:line="240" w:lineRule="auto"/>
+              <w:jc w:val="left"/>
             </w:pPr>
             <w:r>
               <w:t xml:space="preserve">Pada sedimen dan isi perut ikan</w:t>
@@ -1021,13 +1160,18 @@
         </w:tc>
       </w:tr>
       <w:tr>
-        <w:tc>
-          <w:tcPr>
-            <w:tcW w:w="600" w:type="dxa"/>
-          </w:tcPr>
-          <w:p>
-            <w:pPr>
-              <w:spacing w:after="60" w:line="240" w:lineRule="auto"/>
+        <w:trPr>
+          <w:cantSplit/>
+        </w:trPr>
+        <w:tc>
+          <w:tcPr>
+            <w:tcW w:w="700" w:type="dxa"/>
+            <w:vAlign w:val="center"/>
+          </w:tcPr>
+          <w:p>
+            <w:pPr>
+              <w:spacing w:before="40" w:after="40" w:line="240" w:lineRule="auto"/>
+              <w:jc w:val="center"/>
             </w:pPr>
             <w:r>
               <w:t xml:space="preserve">5</w:t>
@@ -1036,11 +1180,13 @@
         </w:tc>
         <w:tc>
           <w:tcPr>
-            <w:tcW w:w="3200" w:type="dxa"/>
-          </w:tcPr>
-          <w:p>
-            <w:pPr>
-              <w:spacing w:after="60" w:line="240" w:lineRule="auto"/>
+            <w:tcW w:w="3600" w:type="dxa"/>
+            <w:vAlign w:val="center"/>
+          </w:tcPr>
+          <w:p>
+            <w:pPr>
+              <w:spacing w:before="40" w:after="40" w:line="240" w:lineRule="auto"/>
+              <w:jc w:val="left"/>
             </w:pPr>
             <w:r>
               <w:t xml:space="preserve">Penilaian kelayakan keamanan pangan</w:t>
@@ -1049,11 +1195,13 @@
         </w:tc>
         <w:tc>
           <w:tcPr>
-            <w:tcW w:w="5272" w:type="dxa"/>
-          </w:tcPr>
-          <w:p>
-            <w:pPr>
-              <w:spacing w:after="60" w:line="240" w:lineRule="auto"/>
+            <w:tcW w:w="4772" w:type="dxa"/>
+            <w:vAlign w:val="center"/>
+          </w:tcPr>
+          <w:p>
+            <w:pPr>
+              <w:spacing w:before="40" w:after="40" w:line="240" w:lineRule="auto"/>
+              <w:jc w:val="left"/>
             </w:pPr>
             <w:r>
               <w:t xml:space="preserve">Status aman atau tidaknya ikan untuk dikonsumsi</w:t>
@@ -1062,13 +1210,18 @@
         </w:tc>
       </w:tr>
       <w:tr>
-        <w:tc>
-          <w:tcPr>
-            <w:tcW w:w="600" w:type="dxa"/>
-          </w:tcPr>
-          <w:p>
-            <w:pPr>
-              <w:spacing w:after="60" w:line="240" w:lineRule="auto"/>
+        <w:trPr>
+          <w:cantSplit/>
+        </w:trPr>
+        <w:tc>
+          <w:tcPr>
+            <w:tcW w:w="700" w:type="dxa"/>
+            <w:vAlign w:val="center"/>
+          </w:tcPr>
+          <w:p>
+            <w:pPr>
+              <w:spacing w:before="40" w:after="40" w:line="240" w:lineRule="auto"/>
+              <w:jc w:val="center"/>
             </w:pPr>
             <w:r>
               <w:t xml:space="preserve">6</w:t>
@@ -1077,11 +1230,13 @@
         </w:tc>
         <w:tc>
           <w:tcPr>
-            <w:tcW w:w="3200" w:type="dxa"/>
-          </w:tcPr>
-          <w:p>
-            <w:pPr>
-              <w:spacing w:after="60" w:line="240" w:lineRule="auto"/>
+            <w:tcW w:w="3600" w:type="dxa"/>
+            <w:vAlign w:val="center"/>
+          </w:tcPr>
+          <w:p>
+            <w:pPr>
+              <w:spacing w:before="40" w:after="40" w:line="240" w:lineRule="auto"/>
+              <w:jc w:val="left"/>
             </w:pPr>
             <w:r>
               <w:t xml:space="preserve">Rekomendasi distribusi hasil perikanan untuk SPPG</w:t>
@@ -1090,11 +1245,13 @@
         </w:tc>
         <w:tc>
           <w:tcPr>
-            <w:tcW w:w="5272" w:type="dxa"/>
-          </w:tcPr>
-          <w:p>
-            <w:pPr>
-              <w:spacing w:after="60" w:line="240" w:lineRule="auto"/>
+            <w:tcW w:w="4772" w:type="dxa"/>
+            <w:vAlign w:val="center"/>
+          </w:tcPr>
+          <w:p>
+            <w:pPr>
+              <w:spacing w:before="40" w:after="40" w:line="240" w:lineRule="auto"/>
+              <w:jc w:val="left"/>
             </w:pPr>
             <w:r>
               <w:t xml:space="preserve">Panduan bagi SPPG dalam memilih ikan yang layak untuk program MBG</w:t>
@@ -1103,13 +1260,18 @@
         </w:tc>
       </w:tr>
       <w:tr>
-        <w:tc>
-          <w:tcPr>
-            <w:tcW w:w="600" w:type="dxa"/>
-          </w:tcPr>
-          <w:p>
-            <w:pPr>
-              <w:spacing w:after="60" w:line="240" w:lineRule="auto"/>
+        <w:trPr>
+          <w:cantSplit/>
+        </w:trPr>
+        <w:tc>
+          <w:tcPr>
+            <w:tcW w:w="700" w:type="dxa"/>
+            <w:vAlign w:val="center"/>
+          </w:tcPr>
+          <w:p>
+            <w:pPr>
+              <w:spacing w:before="40" w:after="40" w:line="240" w:lineRule="auto"/>
+              <w:jc w:val="center"/>
             </w:pPr>
             <w:r>
               <w:t xml:space="preserve">7</w:t>
@@ -1118,11 +1280,13 @@
         </w:tc>
         <w:tc>
           <w:tcPr>
-            <w:tcW w:w="3200" w:type="dxa"/>
-          </w:tcPr>
-          <w:p>
-            <w:pPr>
-              <w:spacing w:after="60" w:line="240" w:lineRule="auto"/>
+            <w:tcW w:w="3600" w:type="dxa"/>
+            <w:vAlign w:val="center"/>
+          </w:tcPr>
+          <w:p>
+            <w:pPr>
+              <w:spacing w:before="40" w:after="40" w:line="240" w:lineRule="auto"/>
+              <w:jc w:val="left"/>
             </w:pPr>
             <w:r>
               <w:t xml:space="preserve">Rekomendasi mitigasi pencemaran</w:t>
@@ -1131,11 +1295,13 @@
         </w:tc>
         <w:tc>
           <w:tcPr>
-            <w:tcW w:w="5272" w:type="dxa"/>
-          </w:tcPr>
-          <w:p>
-            <w:pPr>
-              <w:spacing w:after="60" w:line="240" w:lineRule="auto"/>
+            <w:tcW w:w="4772" w:type="dxa"/>
+            <w:vAlign w:val="center"/>
+          </w:tcPr>
+          <w:p>
+            <w:pPr>
+              <w:spacing w:before="40" w:after="40" w:line="240" w:lineRule="auto"/>
+              <w:jc w:val="left"/>
             </w:pPr>
             <w:r>
               <w:t xml:space="preserve">Langkah-langkah mengurangi dampak mikroplastik terhadap hasil perikanan</w:t>
@@ -1179,75 +1345,62 @@
     <w:tbl>
       <w:tblPr>
         <w:tblW w:w="9072" w:type="dxa"/>
+        <w:tblInd w:w="0" w:type="dxa"/>
         <w:tblBorders>
-          <w:top w:val="single" w:sz="4" w:space="0" w:color="000000"/>
-          <w:left w:val="single" w:sz="4" w:space="0" w:color="000000"/>
-          <w:bottom w:val="single" w:sz="4" w:space="0" w:color="000000"/>
-          <w:right w:val="single" w:sz="4" w:space="0" w:color="000000"/>
-          <w:insideH w:val="single" w:sz="4" w:space="0" w:color="000000"/>
-          <w:insideV w:val="single" w:sz="4" w:space="0" w:color="000000"/>
+          <w:top w:val="single" w:sz="6" w:space="0" w:color="000000"/>
+          <w:left w:val="single" w:sz="6" w:space="0" w:color="000000"/>
+          <w:bottom w:val="single" w:sz="6" w:space="0" w:color="000000"/>
+          <w:right w:val="single" w:sz="6" w:space="0" w:color="000000"/>
+          <w:insideH w:val="single" w:sz="6" w:space="0" w:color="000000"/>
+          <w:insideV w:val="single" w:sz="6" w:space="0" w:color="000000"/>
         </w:tblBorders>
-        <w:tblLayout w:type="fixed"/>
+        <w:tblCellMar>
+          <w:top w:w="60" w:type="dxa"/>
+          <w:left w:w="108" w:type="dxa"/>
+          <w:bottom w:w="60" w:type="dxa"/>
+          <w:right w:w="108" w:type="dxa"/>
+        </w:tblCellMar>
       </w:tblPr>
       <w:tblGrid>
-        <w:gridCol w:w="1000"/>
-        <w:gridCol w:w="8072"/>
+        <w:gridCol w:w="9072"/>
       </w:tblGrid>
       <w:tr>
-        <w:tc>
-          <w:tcPr>
-            <w:tcW w:w="1000" w:type="dxa"/>
-          </w:tcPr>
-          <w:p>
-            <w:pPr>
-              <w:spacing w:after="60" w:line="240" w:lineRule="auto"/>
+        <w:trPr>
+          <w:cantSplit/>
+        </w:trPr>
+        <w:tc>
+          <w:tcPr>
+            <w:tcW w:w="9072" w:type="dxa"/>
+            <w:vAlign w:val="center"/>
+            <w:shd w:val="clear" w:color="auto" w:fill="D9E2F3"/>
+          </w:tcPr>
+          <w:p>
+            <w:pPr>
+              <w:spacing w:before="40" w:after="40" w:line="240" w:lineRule="auto"/>
+              <w:jc w:val="center"/>
             </w:pPr>
             <w:r>
               <w:rPr>
                 <w:b/>
               </w:rPr>
-              <w:t xml:space="preserve">Tahap</w:t>
-            </w:r>
-          </w:p>
-        </w:tc>
-        <w:tc>
-          <w:tcPr>
-            <w:tcW w:w="8072" w:type="dxa"/>
-          </w:tcPr>
-          <w:p>
-            <w:pPr>
-              <w:spacing w:after="60" w:line="240" w:lineRule="auto"/>
-            </w:pPr>
-            <w:r>
-              <w:rPr>
-                <w:b/>
-              </w:rPr>
-              <w:t xml:space="preserve">Proses</w:t>
-            </w:r>
-          </w:p>
-        </w:tc>
-      </w:tr>
-      <w:tr>
-        <w:tc>
-          <w:tcPr>
-            <w:tcW w:w="1000" w:type="dxa"/>
-          </w:tcPr>
-          <w:p>
-            <w:pPr>
-              <w:spacing w:after="60" w:line="240" w:lineRule="auto"/>
-            </w:pPr>
-            <w:r>
-              <w:t xml:space="preserve">1</w:t>
-            </w:r>
-          </w:p>
-        </w:tc>
-        <w:tc>
-          <w:tcPr>
-            <w:tcW w:w="8072" w:type="dxa"/>
-          </w:tcPr>
-          <w:p>
-            <w:pPr>
-              <w:spacing w:after="60" w:line="240" w:lineRule="auto"/>
+              <w:t xml:space="preserve">ALUR DISTRIBUSI HASIL PERIKANAN UNTUK PROGRAM MBG</w:t>
+            </w:r>
+          </w:p>
+        </w:tc>
+      </w:tr>
+      <w:tr>
+        <w:trPr>
+          <w:cantSplit/>
+        </w:trPr>
+        <w:tc>
+          <w:tcPr>
+            <w:tcW w:w="9072" w:type="dxa"/>
+            <w:vAlign w:val="center"/>
+          </w:tcPr>
+          <w:p>
+            <w:pPr>
+              <w:spacing w:before="40" w:after="40" w:line="240" w:lineRule="auto"/>
+              <w:jc w:val="center"/>
             </w:pPr>
             <w:r>
               <w:t xml:space="preserve">Fishing Ground Aktif</w:t>
@@ -1256,26 +1409,38 @@
         </w:tc>
       </w:tr>
       <w:tr>
-        <w:tc>
-          <w:tcPr>
-            <w:tcW w:w="1000" w:type="dxa"/>
-          </w:tcPr>
-          <w:p>
-            <w:pPr>
-              <w:spacing w:after="60" w:line="240" w:lineRule="auto"/>
-            </w:pPr>
-            <w:r>
-              <w:t xml:space="preserve">2</w:t>
-            </w:r>
-          </w:p>
-        </w:tc>
-        <w:tc>
-          <w:tcPr>
-            <w:tcW w:w="8072" w:type="dxa"/>
-          </w:tcPr>
-          <w:p>
-            <w:pPr>
-              <w:spacing w:after="60" w:line="240" w:lineRule="auto"/>
+        <w:trPr>
+          <w:cantSplit/>
+        </w:trPr>
+        <w:tc>
+          <w:tcPr>
+            <w:tcW w:w="9072" w:type="dxa"/>
+            <w:vAlign w:val="center"/>
+          </w:tcPr>
+          <w:p>
+            <w:pPr>
+              <w:spacing w:before="40" w:after="40" w:line="240" w:lineRule="auto"/>
+              <w:jc w:val="center"/>
+            </w:pPr>
+            <w:r>
+              <w:t xml:space="preserve">↓</w:t>
+            </w:r>
+          </w:p>
+        </w:tc>
+      </w:tr>
+      <w:tr>
+        <w:trPr>
+          <w:cantSplit/>
+        </w:trPr>
+        <w:tc>
+          <w:tcPr>
+            <w:tcW w:w="9072" w:type="dxa"/>
+            <w:vAlign w:val="center"/>
+          </w:tcPr>
+          <w:p>
+            <w:pPr>
+              <w:spacing w:before="40" w:after="40" w:line="240" w:lineRule="auto"/>
+              <w:jc w:val="center"/>
             </w:pPr>
             <w:r>
               <w:t xml:space="preserve">Penangkapan Ikan Demersal (Sondong &amp; Bottom Gill Net)</w:t>
@@ -1284,26 +1449,38 @@
         </w:tc>
       </w:tr>
       <w:tr>
-        <w:tc>
-          <w:tcPr>
-            <w:tcW w:w="1000" w:type="dxa"/>
-          </w:tcPr>
-          <w:p>
-            <w:pPr>
-              <w:spacing w:after="60" w:line="240" w:lineRule="auto"/>
-            </w:pPr>
-            <w:r>
-              <w:t xml:space="preserve">3</w:t>
-            </w:r>
-          </w:p>
-        </w:tc>
-        <w:tc>
-          <w:tcPr>
-            <w:tcW w:w="8072" w:type="dxa"/>
-          </w:tcPr>
-          <w:p>
-            <w:pPr>
-              <w:spacing w:after="60" w:line="240" w:lineRule="auto"/>
+        <w:trPr>
+          <w:cantSplit/>
+        </w:trPr>
+        <w:tc>
+          <w:tcPr>
+            <w:tcW w:w="9072" w:type="dxa"/>
+            <w:vAlign w:val="center"/>
+          </w:tcPr>
+          <w:p>
+            <w:pPr>
+              <w:spacing w:before="40" w:after="40" w:line="240" w:lineRule="auto"/>
+              <w:jc w:val="center"/>
+            </w:pPr>
+            <w:r>
+              <w:t xml:space="preserve">↓</w:t>
+            </w:r>
+          </w:p>
+        </w:tc>
+      </w:tr>
+      <w:tr>
+        <w:trPr>
+          <w:cantSplit/>
+        </w:trPr>
+        <w:tc>
+          <w:tcPr>
+            <w:tcW w:w="9072" w:type="dxa"/>
+            <w:vAlign w:val="center"/>
+          </w:tcPr>
+          <w:p>
+            <w:pPr>
+              <w:spacing w:before="40" w:after="40" w:line="240" w:lineRule="auto"/>
+              <w:jc w:val="center"/>
             </w:pPr>
             <w:r>
               <w:t xml:space="preserve">Uji Kualitas &amp; Keamanan Pangan (Analisis Mikroplastik, Kontaminan, Kesegaran)</w:t>
@@ -1312,82 +1489,98 @@
         </w:tc>
       </w:tr>
       <w:tr>
-        <w:tc>
-          <w:tcPr>
-            <w:tcW w:w="1000" w:type="dxa"/>
-          </w:tcPr>
-          <w:p>
-            <w:pPr>
-              <w:spacing w:after="60" w:line="240" w:lineRule="auto"/>
-            </w:pPr>
-            <w:r>
-              <w:t xml:space="preserve">4a</w:t>
-            </w:r>
-          </w:p>
-        </w:tc>
-        <w:tc>
-          <w:tcPr>
-            <w:tcW w:w="8072" w:type="dxa"/>
-          </w:tcPr>
-          <w:p>
-            <w:pPr>
-              <w:spacing w:after="60" w:line="240" w:lineRule="auto"/>
-            </w:pPr>
-            <w:r>
-              <w:t xml:space="preserve">[LAYAK] --&gt; SPPG (Sentra Pengolahan Pangan Gabungan)</w:t>
-            </w:r>
-          </w:p>
-        </w:tc>
-      </w:tr>
-      <w:tr>
-        <w:tc>
-          <w:tcPr>
-            <w:tcW w:w="1000" w:type="dxa"/>
-          </w:tcPr>
-          <w:p>
-            <w:pPr>
-              <w:spacing w:after="60" w:line="240" w:lineRule="auto"/>
-            </w:pPr>
-            <w:r>
-              <w:t xml:space="preserve">4b</w:t>
-            </w:r>
-          </w:p>
-        </w:tc>
-        <w:tc>
-          <w:tcPr>
-            <w:tcW w:w="8072" w:type="dxa"/>
-          </w:tcPr>
-          <w:p>
-            <w:pPr>
-              <w:spacing w:after="60" w:line="240" w:lineRule="auto"/>
-            </w:pPr>
-            <w:r>
-              <w:t xml:space="preserve">[TIDAK LAYAK] --&gt; Ditolak / Dialihkan ke penggunaan non-pangan</w:t>
-            </w:r>
-          </w:p>
-        </w:tc>
-      </w:tr>
-      <w:tr>
-        <w:tc>
-          <w:tcPr>
-            <w:tcW w:w="1000" w:type="dxa"/>
-          </w:tcPr>
-          <w:p>
-            <w:pPr>
-              <w:spacing w:after="60" w:line="240" w:lineRule="auto"/>
-            </w:pPr>
-            <w:r>
-              <w:t xml:space="preserve">5</w:t>
-            </w:r>
-          </w:p>
-        </w:tc>
-        <w:tc>
-          <w:tcPr>
-            <w:tcW w:w="8072" w:type="dxa"/>
-          </w:tcPr>
-          <w:p>
-            <w:pPr>
-              <w:spacing w:after="60" w:line="240" w:lineRule="auto"/>
+        <w:trPr>
+          <w:cantSplit/>
+        </w:trPr>
+        <w:tc>
+          <w:tcPr>
+            <w:tcW w:w="9072" w:type="dxa"/>
+            <w:vAlign w:val="center"/>
+          </w:tcPr>
+          <w:p>
+            <w:pPr>
+              <w:spacing w:before="40" w:after="40" w:line="240" w:lineRule="auto"/>
+              <w:jc w:val="center"/>
+            </w:pPr>
+            <w:r>
+              <w:t xml:space="preserve">↓</w:t>
+            </w:r>
+          </w:p>
+        </w:tc>
+      </w:tr>
+      <w:tr>
+        <w:trPr>
+          <w:cantSplit/>
+        </w:trPr>
+        <w:tc>
+          <w:tcPr>
+            <w:tcW w:w="9072" w:type="dxa"/>
+            <w:vAlign w:val="center"/>
+          </w:tcPr>
+          <w:p>
+            <w:pPr>
+              <w:spacing w:before="40" w:after="40" w:line="240" w:lineRule="auto"/>
+              <w:jc w:val="center"/>
+            </w:pPr>
+            <w:r>
+              <w:t xml:space="preserve">[LAYAK] → Diteruskan ke SPPG (Sentra Pengolahan Pangan Gabungan)</w:t>
+            </w:r>
+          </w:p>
+        </w:tc>
+      </w:tr>
+      <w:tr>
+        <w:trPr>
+          <w:cantSplit/>
+        </w:trPr>
+        <w:tc>
+          <w:tcPr>
+            <w:tcW w:w="9072" w:type="dxa"/>
+            <w:vAlign w:val="center"/>
+          </w:tcPr>
+          <w:p>
+            <w:pPr>
+              <w:spacing w:before="40" w:after="40" w:line="240" w:lineRule="auto"/>
+              <w:jc w:val="center"/>
+            </w:pPr>
+            <w:r>
+              <w:t xml:space="preserve">[TIDAK LAYAK] → Ditolak / Dialihkan ke penggunaan non-pangan</w:t>
+            </w:r>
+          </w:p>
+        </w:tc>
+      </w:tr>
+      <w:tr>
+        <w:trPr>
+          <w:cantSplit/>
+        </w:trPr>
+        <w:tc>
+          <w:tcPr>
+            <w:tcW w:w="9072" w:type="dxa"/>
+            <w:vAlign w:val="center"/>
+          </w:tcPr>
+          <w:p>
+            <w:pPr>
+              <w:spacing w:before="40" w:after="40" w:line="240" w:lineRule="auto"/>
+              <w:jc w:val="center"/>
+            </w:pPr>
+            <w:r>
+              <w:t xml:space="preserve">↓</w:t>
+            </w:r>
+          </w:p>
+        </w:tc>
+      </w:tr>
+      <w:tr>
+        <w:trPr>
+          <w:cantSplit/>
+        </w:trPr>
+        <w:tc>
+          <w:tcPr>
+            <w:tcW w:w="9072" w:type="dxa"/>
+            <w:vAlign w:val="center"/>
+          </w:tcPr>
+          <w:p>
+            <w:pPr>
+              <w:spacing w:before="40" w:after="40" w:line="240" w:lineRule="auto"/>
+              <w:jc w:val="center"/>
             </w:pPr>
             <w:r>
               <w:t xml:space="preserve">Pengolahan &amp; Pengemasan di SPPG</w:t>
@@ -1396,26 +1589,38 @@
         </w:tc>
       </w:tr>
       <w:tr>
-        <w:tc>
-          <w:tcPr>
-            <w:tcW w:w="1000" w:type="dxa"/>
-          </w:tcPr>
-          <w:p>
-            <w:pPr>
-              <w:spacing w:after="60" w:line="240" w:lineRule="auto"/>
-            </w:pPr>
-            <w:r>
-              <w:t xml:space="preserve">6</w:t>
-            </w:r>
-          </w:p>
-        </w:tc>
-        <w:tc>
-          <w:tcPr>
-            <w:tcW w:w="8072" w:type="dxa"/>
-          </w:tcPr>
-          <w:p>
-            <w:pPr>
-              <w:spacing w:after="60" w:line="240" w:lineRule="auto"/>
+        <w:trPr>
+          <w:cantSplit/>
+        </w:trPr>
+        <w:tc>
+          <w:tcPr>
+            <w:tcW w:w="9072" w:type="dxa"/>
+            <w:vAlign w:val="center"/>
+          </w:tcPr>
+          <w:p>
+            <w:pPr>
+              <w:spacing w:before="40" w:after="40" w:line="240" w:lineRule="auto"/>
+              <w:jc w:val="center"/>
+            </w:pPr>
+            <w:r>
+              <w:t xml:space="preserve">↓</w:t>
+            </w:r>
+          </w:p>
+        </w:tc>
+      </w:tr>
+      <w:tr>
+        <w:trPr>
+          <w:cantSplit/>
+        </w:trPr>
+        <w:tc>
+          <w:tcPr>
+            <w:tcW w:w="9072" w:type="dxa"/>
+            <w:vAlign w:val="center"/>
+          </w:tcPr>
+          <w:p>
+            <w:pPr>
+              <w:spacing w:before="40" w:after="40" w:line="240" w:lineRule="auto"/>
+              <w:jc w:val="center"/>
             </w:pPr>
             <w:r>
               <w:t xml:space="preserve">Distribusi ke Program MBG (Sekolah &amp; Kelompok Sasaran)</w:t>
@@ -1539,32 +1744,44 @@
     <w:tbl>
       <w:tblPr>
         <w:tblW w:w="9072" w:type="dxa"/>
+        <w:tblInd w:w="0" w:type="dxa"/>
         <w:tblBorders>
-          <w:top w:val="single" w:sz="4" w:space="0" w:color="000000"/>
-          <w:left w:val="single" w:sz="4" w:space="0" w:color="000000"/>
-          <w:bottom w:val="single" w:sz="4" w:space="0" w:color="000000"/>
-          <w:right w:val="single" w:sz="4" w:space="0" w:color="000000"/>
-          <w:insideH w:val="single" w:sz="4" w:space="0" w:color="000000"/>
-          <w:insideV w:val="single" w:sz="4" w:space="0" w:color="000000"/>
+          <w:top w:val="single" w:sz="6" w:space="0" w:color="000000"/>
+          <w:left w:val="single" w:sz="6" w:space="0" w:color="000000"/>
+          <w:bottom w:val="single" w:sz="6" w:space="0" w:color="000000"/>
+          <w:right w:val="single" w:sz="6" w:space="0" w:color="000000"/>
+          <w:insideH w:val="single" w:sz="6" w:space="0" w:color="000000"/>
+          <w:insideV w:val="single" w:sz="6" w:space="0" w:color="000000"/>
         </w:tblBorders>
-        <w:tblLayout w:type="fixed"/>
+        <w:tblCellMar>
+          <w:top w:w="60" w:type="dxa"/>
+          <w:left w:w="108" w:type="dxa"/>
+          <w:bottom w:w="60" w:type="dxa"/>
+          <w:right w:w="108" w:type="dxa"/>
+        </w:tblCellMar>
       </w:tblPr>
       <w:tblGrid>
-        <w:gridCol w:w="3072"/>
-        <w:gridCol w:w="1200"/>
-        <w:gridCol w:w="1200"/>
-        <w:gridCol w:w="1200"/>
-        <w:gridCol w:w="1200"/>
-        <w:gridCol w:w="1200"/>
+        <w:gridCol w:w="3572"/>
+        <w:gridCol w:w="1100"/>
+        <w:gridCol w:w="1100"/>
+        <w:gridCol w:w="1100"/>
+        <w:gridCol w:w="1100"/>
+        <w:gridCol w:w="1100"/>
       </w:tblGrid>
       <w:tr>
-        <w:tc>
-          <w:tcPr>
-            <w:tcW w:w="3072" w:type="dxa"/>
-          </w:tcPr>
-          <w:p>
-            <w:pPr>
-              <w:spacing w:after="60" w:line="240" w:lineRule="auto"/>
+        <w:trPr>
+          <w:cantSplit/>
+        </w:trPr>
+        <w:tc>
+          <w:tcPr>
+            <w:tcW w:w="3572" w:type="dxa"/>
+            <w:vAlign w:val="center"/>
+            <w:shd w:val="clear" w:color="auto" w:fill="D9E2F3"/>
+          </w:tcPr>
+          <w:p>
+            <w:pPr>
+              <w:spacing w:before="40" w:after="40" w:line="240" w:lineRule="auto"/>
+              <w:jc w:val="center"/>
             </w:pPr>
             <w:r>
               <w:rPr>
@@ -1576,11 +1793,14 @@
         </w:tc>
         <w:tc>
           <w:tcPr>
-            <w:tcW w:w="1200" w:type="dxa"/>
-          </w:tcPr>
-          <w:p>
-            <w:pPr>
-              <w:spacing w:after="60" w:line="240" w:lineRule="auto"/>
+            <w:tcW w:w="1100" w:type="dxa"/>
+            <w:vAlign w:val="center"/>
+            <w:shd w:val="clear" w:color="auto" w:fill="D9E2F3"/>
+          </w:tcPr>
+          <w:p>
+            <w:pPr>
+              <w:spacing w:before="40" w:after="40" w:line="240" w:lineRule="auto"/>
+              <w:jc w:val="center"/>
             </w:pPr>
             <w:r>
               <w:rPr>
@@ -1592,11 +1812,14 @@
         </w:tc>
         <w:tc>
           <w:tcPr>
-            <w:tcW w:w="1200" w:type="dxa"/>
-          </w:tcPr>
-          <w:p>
-            <w:pPr>
-              <w:spacing w:after="60" w:line="240" w:lineRule="auto"/>
+            <w:tcW w:w="1100" w:type="dxa"/>
+            <w:vAlign w:val="center"/>
+            <w:shd w:val="clear" w:color="auto" w:fill="D9E2F3"/>
+          </w:tcPr>
+          <w:p>
+            <w:pPr>
+              <w:spacing w:before="40" w:after="40" w:line="240" w:lineRule="auto"/>
+              <w:jc w:val="center"/>
             </w:pPr>
             <w:r>
               <w:rPr>
@@ -1608,11 +1831,14 @@
         </w:tc>
         <w:tc>
           <w:tcPr>
-            <w:tcW w:w="1200" w:type="dxa"/>
-          </w:tcPr>
-          <w:p>
-            <w:pPr>
-              <w:spacing w:after="60" w:line="240" w:lineRule="auto"/>
+            <w:tcW w:w="1100" w:type="dxa"/>
+            <w:vAlign w:val="center"/>
+            <w:shd w:val="clear" w:color="auto" w:fill="D9E2F3"/>
+          </w:tcPr>
+          <w:p>
+            <w:pPr>
+              <w:spacing w:before="40" w:after="40" w:line="240" w:lineRule="auto"/>
+              <w:jc w:val="center"/>
             </w:pPr>
             <w:r>
               <w:rPr>
@@ -1624,11 +1850,14 @@
         </w:tc>
         <w:tc>
           <w:tcPr>
-            <w:tcW w:w="1200" w:type="dxa"/>
-          </w:tcPr>
-          <w:p>
-            <w:pPr>
-              <w:spacing w:after="60" w:line="240" w:lineRule="auto"/>
+            <w:tcW w:w="1100" w:type="dxa"/>
+            <w:vAlign w:val="center"/>
+            <w:shd w:val="clear" w:color="auto" w:fill="D9E2F3"/>
+          </w:tcPr>
+          <w:p>
+            <w:pPr>
+              <w:spacing w:before="40" w:after="40" w:line="240" w:lineRule="auto"/>
+              <w:jc w:val="center"/>
             </w:pPr>
             <w:r>
               <w:rPr>
@@ -1640,11 +1869,14 @@
         </w:tc>
         <w:tc>
           <w:tcPr>
-            <w:tcW w:w="1200" w:type="dxa"/>
-          </w:tcPr>
-          <w:p>
-            <w:pPr>
-              <w:spacing w:after="60" w:line="240" w:lineRule="auto"/>
+            <w:tcW w:w="1100" w:type="dxa"/>
+            <w:vAlign w:val="center"/>
+            <w:shd w:val="clear" w:color="auto" w:fill="D9E2F3"/>
+          </w:tcPr>
+          <w:p>
+            <w:pPr>
+              <w:spacing w:before="40" w:after="40" w:line="240" w:lineRule="auto"/>
+              <w:jc w:val="center"/>
             </w:pPr>
             <w:r>
               <w:rPr>
@@ -1656,13 +1888,18 @@
         </w:tc>
       </w:tr>
       <w:tr>
-        <w:tc>
-          <w:tcPr>
-            <w:tcW w:w="3072" w:type="dxa"/>
-          </w:tcPr>
-          <w:p>
-            <w:pPr>
-              <w:spacing w:after="60" w:line="240" w:lineRule="auto"/>
+        <w:trPr>
+          <w:cantSplit/>
+        </w:trPr>
+        <w:tc>
+          <w:tcPr>
+            <w:tcW w:w="3572" w:type="dxa"/>
+            <w:vAlign w:val="center"/>
+          </w:tcPr>
+          <w:p>
+            <w:pPr>
+              <w:spacing w:before="40" w:after="40" w:line="240" w:lineRule="auto"/>
+              <w:jc w:val="left"/>
             </w:pPr>
             <w:r>
               <w:t xml:space="preserve">Persiapan &amp; survei awal</w:t>
@@ -1671,11 +1908,13 @@
         </w:tc>
         <w:tc>
           <w:tcPr>
-            <w:tcW w:w="1200" w:type="dxa"/>
-          </w:tcPr>
-          <w:p>
-            <w:pPr>
-              <w:spacing w:after="60" w:line="240" w:lineRule="auto"/>
+            <w:tcW w:w="1100" w:type="dxa"/>
+            <w:vAlign w:val="center"/>
+          </w:tcPr>
+          <w:p>
+            <w:pPr>
+              <w:spacing w:before="40" w:after="40" w:line="240" w:lineRule="auto"/>
+              <w:jc w:val="center"/>
             </w:pPr>
             <w:r>
               <w:t xml:space="preserve">X</w:t>
@@ -1684,11 +1923,13 @@
         </w:tc>
         <w:tc>
           <w:tcPr>
-            <w:tcW w:w="1200" w:type="dxa"/>
-          </w:tcPr>
-          <w:p>
-            <w:pPr>
-              <w:spacing w:after="60" w:line="240" w:lineRule="auto"/>
+            <w:tcW w:w="1100" w:type="dxa"/>
+            <w:vAlign w:val="center"/>
+          </w:tcPr>
+          <w:p>
+            <w:pPr>
+              <w:spacing w:before="40" w:after="40" w:line="240" w:lineRule="auto"/>
+              <w:jc w:val="center"/>
             </w:pPr>
             <w:r>
               <w:t xml:space="preserve"/>
@@ -1697,11 +1938,13 @@
         </w:tc>
         <w:tc>
           <w:tcPr>
-            <w:tcW w:w="1200" w:type="dxa"/>
-          </w:tcPr>
-          <w:p>
-            <w:pPr>
-              <w:spacing w:after="60" w:line="240" w:lineRule="auto"/>
+            <w:tcW w:w="1100" w:type="dxa"/>
+            <w:vAlign w:val="center"/>
+          </w:tcPr>
+          <w:p>
+            <w:pPr>
+              <w:spacing w:before="40" w:after="40" w:line="240" w:lineRule="auto"/>
+              <w:jc w:val="center"/>
             </w:pPr>
             <w:r>
               <w:t xml:space="preserve"/>
@@ -1710,11 +1953,13 @@
         </w:tc>
         <w:tc>
           <w:tcPr>
-            <w:tcW w:w="1200" w:type="dxa"/>
-          </w:tcPr>
-          <w:p>
-            <w:pPr>
-              <w:spacing w:after="60" w:line="240" w:lineRule="auto"/>
+            <w:tcW w:w="1100" w:type="dxa"/>
+            <w:vAlign w:val="center"/>
+          </w:tcPr>
+          <w:p>
+            <w:pPr>
+              <w:spacing w:before="40" w:after="40" w:line="240" w:lineRule="auto"/>
+              <w:jc w:val="center"/>
             </w:pPr>
             <w:r>
               <w:t xml:space="preserve"/>
@@ -1723,11 +1968,13 @@
         </w:tc>
         <w:tc>
           <w:tcPr>
-            <w:tcW w:w="1200" w:type="dxa"/>
-          </w:tcPr>
-          <w:p>
-            <w:pPr>
-              <w:spacing w:after="60" w:line="240" w:lineRule="auto"/>
+            <w:tcW w:w="1100" w:type="dxa"/>
+            <w:vAlign w:val="center"/>
+          </w:tcPr>
+          <w:p>
+            <w:pPr>
+              <w:spacing w:before="40" w:after="40" w:line="240" w:lineRule="auto"/>
+              <w:jc w:val="center"/>
             </w:pPr>
             <w:r>
               <w:t xml:space="preserve"/>
@@ -1736,13 +1983,18 @@
         </w:tc>
       </w:tr>
       <w:tr>
-        <w:tc>
-          <w:tcPr>
-            <w:tcW w:w="3072" w:type="dxa"/>
-          </w:tcPr>
-          <w:p>
-            <w:pPr>
-              <w:spacing w:after="60" w:line="240" w:lineRule="auto"/>
+        <w:trPr>
+          <w:cantSplit/>
+        </w:trPr>
+        <w:tc>
+          <w:tcPr>
+            <w:tcW w:w="3572" w:type="dxa"/>
+            <w:vAlign w:val="center"/>
+          </w:tcPr>
+          <w:p>
+            <w:pPr>
+              <w:spacing w:before="40" w:after="40" w:line="240" w:lineRule="auto"/>
+              <w:jc w:val="left"/>
             </w:pPr>
             <w:r>
               <w:t xml:space="preserve">Pengambilan data Musim Timur</w:t>
@@ -1751,11 +2003,13 @@
         </w:tc>
         <w:tc>
           <w:tcPr>
-            <w:tcW w:w="1200" w:type="dxa"/>
-          </w:tcPr>
-          <w:p>
-            <w:pPr>
-              <w:spacing w:after="60" w:line="240" w:lineRule="auto"/>
+            <w:tcW w:w="1100" w:type="dxa"/>
+            <w:vAlign w:val="center"/>
+          </w:tcPr>
+          <w:p>
+            <w:pPr>
+              <w:spacing w:before="40" w:after="40" w:line="240" w:lineRule="auto"/>
+              <w:jc w:val="center"/>
             </w:pPr>
             <w:r>
               <w:t xml:space="preserve"/>
@@ -1764,11 +2018,13 @@
         </w:tc>
         <w:tc>
           <w:tcPr>
-            <w:tcW w:w="1200" w:type="dxa"/>
-          </w:tcPr>
-          <w:p>
-            <w:pPr>
-              <w:spacing w:after="60" w:line="240" w:lineRule="auto"/>
+            <w:tcW w:w="1100" w:type="dxa"/>
+            <w:vAlign w:val="center"/>
+          </w:tcPr>
+          <w:p>
+            <w:pPr>
+              <w:spacing w:before="40" w:after="40" w:line="240" w:lineRule="auto"/>
+              <w:jc w:val="center"/>
             </w:pPr>
             <w:r>
               <w:t xml:space="preserve">X</w:t>
@@ -1777,11 +2033,13 @@
         </w:tc>
         <w:tc>
           <w:tcPr>
-            <w:tcW w:w="1200" w:type="dxa"/>
-          </w:tcPr>
-          <w:p>
-            <w:pPr>
-              <w:spacing w:after="60" w:line="240" w:lineRule="auto"/>
+            <w:tcW w:w="1100" w:type="dxa"/>
+            <w:vAlign w:val="center"/>
+          </w:tcPr>
+          <w:p>
+            <w:pPr>
+              <w:spacing w:before="40" w:after="40" w:line="240" w:lineRule="auto"/>
+              <w:jc w:val="center"/>
             </w:pPr>
             <w:r>
               <w:t xml:space="preserve"/>
@@ -1790,11 +2048,13 @@
         </w:tc>
         <w:tc>
           <w:tcPr>
-            <w:tcW w:w="1200" w:type="dxa"/>
-          </w:tcPr>
-          <w:p>
-            <w:pPr>
-              <w:spacing w:after="60" w:line="240" w:lineRule="auto"/>
+            <w:tcW w:w="1100" w:type="dxa"/>
+            <w:vAlign w:val="center"/>
+          </w:tcPr>
+          <w:p>
+            <w:pPr>
+              <w:spacing w:before="40" w:after="40" w:line="240" w:lineRule="auto"/>
+              <w:jc w:val="center"/>
             </w:pPr>
             <w:r>
               <w:t xml:space="preserve"/>
@@ -1803,11 +2063,13 @@
         </w:tc>
         <w:tc>
           <w:tcPr>
-            <w:tcW w:w="1200" w:type="dxa"/>
-          </w:tcPr>
-          <w:p>
-            <w:pPr>
-              <w:spacing w:after="60" w:line="240" w:lineRule="auto"/>
+            <w:tcW w:w="1100" w:type="dxa"/>
+            <w:vAlign w:val="center"/>
+          </w:tcPr>
+          <w:p>
+            <w:pPr>
+              <w:spacing w:before="40" w:after="40" w:line="240" w:lineRule="auto"/>
+              <w:jc w:val="center"/>
             </w:pPr>
             <w:r>
               <w:t xml:space="preserve"/>
@@ -1816,13 +2078,18 @@
         </w:tc>
       </w:tr>
       <w:tr>
-        <w:tc>
-          <w:tcPr>
-            <w:tcW w:w="3072" w:type="dxa"/>
-          </w:tcPr>
-          <w:p>
-            <w:pPr>
-              <w:spacing w:after="60" w:line="240" w:lineRule="auto"/>
+        <w:trPr>
+          <w:cantSplit/>
+        </w:trPr>
+        <w:tc>
+          <w:tcPr>
+            <w:tcW w:w="3572" w:type="dxa"/>
+            <w:vAlign w:val="center"/>
+          </w:tcPr>
+          <w:p>
+            <w:pPr>
+              <w:spacing w:before="40" w:after="40" w:line="240" w:lineRule="auto"/>
+              <w:jc w:val="left"/>
             </w:pPr>
             <w:r>
               <w:t xml:space="preserve">Pengambilan data Musim Peralihan</w:t>
@@ -1831,11 +2098,13 @@
         </w:tc>
         <w:tc>
           <w:tcPr>
-            <w:tcW w:w="1200" w:type="dxa"/>
-          </w:tcPr>
-          <w:p>
-            <w:pPr>
-              <w:spacing w:after="60" w:line="240" w:lineRule="auto"/>
+            <w:tcW w:w="1100" w:type="dxa"/>
+            <w:vAlign w:val="center"/>
+          </w:tcPr>
+          <w:p>
+            <w:pPr>
+              <w:spacing w:before="40" w:after="40" w:line="240" w:lineRule="auto"/>
+              <w:jc w:val="center"/>
             </w:pPr>
             <w:r>
               <w:t xml:space="preserve"/>
@@ -1844,11 +2113,13 @@
         </w:tc>
         <w:tc>
           <w:tcPr>
-            <w:tcW w:w="1200" w:type="dxa"/>
-          </w:tcPr>
-          <w:p>
-            <w:pPr>
-              <w:spacing w:after="60" w:line="240" w:lineRule="auto"/>
+            <w:tcW w:w="1100" w:type="dxa"/>
+            <w:vAlign w:val="center"/>
+          </w:tcPr>
+          <w:p>
+            <w:pPr>
+              <w:spacing w:before="40" w:after="40" w:line="240" w:lineRule="auto"/>
+              <w:jc w:val="center"/>
             </w:pPr>
             <w:r>
               <w:t xml:space="preserve"/>
@@ -1857,11 +2128,13 @@
         </w:tc>
         <w:tc>
           <w:tcPr>
-            <w:tcW w:w="1200" w:type="dxa"/>
-          </w:tcPr>
-          <w:p>
-            <w:pPr>
-              <w:spacing w:after="60" w:line="240" w:lineRule="auto"/>
+            <w:tcW w:w="1100" w:type="dxa"/>
+            <w:vAlign w:val="center"/>
+          </w:tcPr>
+          <w:p>
+            <w:pPr>
+              <w:spacing w:before="40" w:after="40" w:line="240" w:lineRule="auto"/>
+              <w:jc w:val="center"/>
             </w:pPr>
             <w:r>
               <w:t xml:space="preserve">X</w:t>
@@ -1870,11 +2143,13 @@
         </w:tc>
         <w:tc>
           <w:tcPr>
-            <w:tcW w:w="1200" w:type="dxa"/>
-          </w:tcPr>
-          <w:p>
-            <w:pPr>
-              <w:spacing w:after="60" w:line="240" w:lineRule="auto"/>
+            <w:tcW w:w="1100" w:type="dxa"/>
+            <w:vAlign w:val="center"/>
+          </w:tcPr>
+          <w:p>
+            <w:pPr>
+              <w:spacing w:before="40" w:after="40" w:line="240" w:lineRule="auto"/>
+              <w:jc w:val="center"/>
             </w:pPr>
             <w:r>
               <w:t xml:space="preserve"/>
@@ -1883,11 +2158,13 @@
         </w:tc>
         <w:tc>
           <w:tcPr>
-            <w:tcW w:w="1200" w:type="dxa"/>
-          </w:tcPr>
-          <w:p>
-            <w:pPr>
-              <w:spacing w:after="60" w:line="240" w:lineRule="auto"/>
+            <w:tcW w:w="1100" w:type="dxa"/>
+            <w:vAlign w:val="center"/>
+          </w:tcPr>
+          <w:p>
+            <w:pPr>
+              <w:spacing w:before="40" w:after="40" w:line="240" w:lineRule="auto"/>
+              <w:jc w:val="center"/>
             </w:pPr>
             <w:r>
               <w:t xml:space="preserve"/>
@@ -1896,13 +2173,18 @@
         </w:tc>
       </w:tr>
       <w:tr>
-        <w:tc>
-          <w:tcPr>
-            <w:tcW w:w="3072" w:type="dxa"/>
-          </w:tcPr>
-          <w:p>
-            <w:pPr>
-              <w:spacing w:after="60" w:line="240" w:lineRule="auto"/>
+        <w:trPr>
+          <w:cantSplit/>
+        </w:trPr>
+        <w:tc>
+          <w:tcPr>
+            <w:tcW w:w="3572" w:type="dxa"/>
+            <w:vAlign w:val="center"/>
+          </w:tcPr>
+          <w:p>
+            <w:pPr>
+              <w:spacing w:before="40" w:after="40" w:line="240" w:lineRule="auto"/>
+              <w:jc w:val="left"/>
             </w:pPr>
             <w:r>
               <w:t xml:space="preserve">Analisis laboratorium</w:t>
@@ -1911,11 +2193,13 @@
         </w:tc>
         <w:tc>
           <w:tcPr>
-            <w:tcW w:w="1200" w:type="dxa"/>
-          </w:tcPr>
-          <w:p>
-            <w:pPr>
-              <w:spacing w:after="60" w:line="240" w:lineRule="auto"/>
+            <w:tcW w:w="1100" w:type="dxa"/>
+            <w:vAlign w:val="center"/>
+          </w:tcPr>
+          <w:p>
+            <w:pPr>
+              <w:spacing w:before="40" w:after="40" w:line="240" w:lineRule="auto"/>
+              <w:jc w:val="center"/>
             </w:pPr>
             <w:r>
               <w:t xml:space="preserve"/>
@@ -1924,11 +2208,13 @@
         </w:tc>
         <w:tc>
           <w:tcPr>
-            <w:tcW w:w="1200" w:type="dxa"/>
-          </w:tcPr>
-          <w:p>
-            <w:pPr>
-              <w:spacing w:after="60" w:line="240" w:lineRule="auto"/>
+            <w:tcW w:w="1100" w:type="dxa"/>
+            <w:vAlign w:val="center"/>
+          </w:tcPr>
+          <w:p>
+            <w:pPr>
+              <w:spacing w:before="40" w:after="40" w:line="240" w:lineRule="auto"/>
+              <w:jc w:val="center"/>
             </w:pPr>
             <w:r>
               <w:t xml:space="preserve"/>
@@ -1937,11 +2223,13 @@
         </w:tc>
         <w:tc>
           <w:tcPr>
-            <w:tcW w:w="1200" w:type="dxa"/>
-          </w:tcPr>
-          <w:p>
-            <w:pPr>
-              <w:spacing w:after="60" w:line="240" w:lineRule="auto"/>
+            <w:tcW w:w="1100" w:type="dxa"/>
+            <w:vAlign w:val="center"/>
+          </w:tcPr>
+          <w:p>
+            <w:pPr>
+              <w:spacing w:before="40" w:after="40" w:line="240" w:lineRule="auto"/>
+              <w:jc w:val="center"/>
             </w:pPr>
             <w:r>
               <w:t xml:space="preserve">X</w:t>
@@ -1950,11 +2238,13 @@
         </w:tc>
         <w:tc>
           <w:tcPr>
-            <w:tcW w:w="1200" w:type="dxa"/>
-          </w:tcPr>
-          <w:p>
-            <w:pPr>
-              <w:spacing w:after="60" w:line="240" w:lineRule="auto"/>
+            <w:tcW w:w="1100" w:type="dxa"/>
+            <w:vAlign w:val="center"/>
+          </w:tcPr>
+          <w:p>
+            <w:pPr>
+              <w:spacing w:before="40" w:after="40" w:line="240" w:lineRule="auto"/>
+              <w:jc w:val="center"/>
             </w:pPr>
             <w:r>
               <w:t xml:space="preserve">X</w:t>
@@ -1963,11 +2253,13 @@
         </w:tc>
         <w:tc>
           <w:tcPr>
-            <w:tcW w:w="1200" w:type="dxa"/>
-          </w:tcPr>
-          <w:p>
-            <w:pPr>
-              <w:spacing w:after="60" w:line="240" w:lineRule="auto"/>
+            <w:tcW w:w="1100" w:type="dxa"/>
+            <w:vAlign w:val="center"/>
+          </w:tcPr>
+          <w:p>
+            <w:pPr>
+              <w:spacing w:before="40" w:after="40" w:line="240" w:lineRule="auto"/>
+              <w:jc w:val="center"/>
             </w:pPr>
             <w:r>
               <w:t xml:space="preserve"/>
@@ -1976,13 +2268,18 @@
         </w:tc>
       </w:tr>
       <w:tr>
-        <w:tc>
-          <w:tcPr>
-            <w:tcW w:w="3072" w:type="dxa"/>
-          </w:tcPr>
-          <w:p>
-            <w:pPr>
-              <w:spacing w:after="60" w:line="240" w:lineRule="auto"/>
+        <w:trPr>
+          <w:cantSplit/>
+        </w:trPr>
+        <w:tc>
+          <w:tcPr>
+            <w:tcW w:w="3572" w:type="dxa"/>
+            <w:vAlign w:val="center"/>
+          </w:tcPr>
+          <w:p>
+            <w:pPr>
+              <w:spacing w:before="40" w:after="40" w:line="240" w:lineRule="auto"/>
+              <w:jc w:val="left"/>
             </w:pPr>
             <w:r>
               <w:t xml:space="preserve">Pengolahan data &amp; analisis</w:t>
@@ -1991,11 +2288,13 @@
         </w:tc>
         <w:tc>
           <w:tcPr>
-            <w:tcW w:w="1200" w:type="dxa"/>
-          </w:tcPr>
-          <w:p>
-            <w:pPr>
-              <w:spacing w:after="60" w:line="240" w:lineRule="auto"/>
+            <w:tcW w:w="1100" w:type="dxa"/>
+            <w:vAlign w:val="center"/>
+          </w:tcPr>
+          <w:p>
+            <w:pPr>
+              <w:spacing w:before="40" w:after="40" w:line="240" w:lineRule="auto"/>
+              <w:jc w:val="center"/>
             </w:pPr>
             <w:r>
               <w:t xml:space="preserve"/>
@@ -2004,11 +2303,13 @@
         </w:tc>
         <w:tc>
           <w:tcPr>
-            <w:tcW w:w="1200" w:type="dxa"/>
-          </w:tcPr>
-          <w:p>
-            <w:pPr>
-              <w:spacing w:after="60" w:line="240" w:lineRule="auto"/>
+            <w:tcW w:w="1100" w:type="dxa"/>
+            <w:vAlign w:val="center"/>
+          </w:tcPr>
+          <w:p>
+            <w:pPr>
+              <w:spacing w:before="40" w:after="40" w:line="240" w:lineRule="auto"/>
+              <w:jc w:val="center"/>
             </w:pPr>
             <w:r>
               <w:t xml:space="preserve"/>
@@ -2017,11 +2318,13 @@
         </w:tc>
         <w:tc>
           <w:tcPr>
-            <w:tcW w:w="1200" w:type="dxa"/>
-          </w:tcPr>
-          <w:p>
-            <w:pPr>
-              <w:spacing w:after="60" w:line="240" w:lineRule="auto"/>
+            <w:tcW w:w="1100" w:type="dxa"/>
+            <w:vAlign w:val="center"/>
+          </w:tcPr>
+          <w:p>
+            <w:pPr>
+              <w:spacing w:before="40" w:after="40" w:line="240" w:lineRule="auto"/>
+              <w:jc w:val="center"/>
             </w:pPr>
             <w:r>
               <w:t xml:space="preserve"/>
@@ -2030,11 +2333,13 @@
         </w:tc>
         <w:tc>
           <w:tcPr>
-            <w:tcW w:w="1200" w:type="dxa"/>
-          </w:tcPr>
-          <w:p>
-            <w:pPr>
-              <w:spacing w:after="60" w:line="240" w:lineRule="auto"/>
+            <w:tcW w:w="1100" w:type="dxa"/>
+            <w:vAlign w:val="center"/>
+          </w:tcPr>
+          <w:p>
+            <w:pPr>
+              <w:spacing w:before="40" w:after="40" w:line="240" w:lineRule="auto"/>
+              <w:jc w:val="center"/>
             </w:pPr>
             <w:r>
               <w:t xml:space="preserve">X</w:t>
@@ -2043,11 +2348,13 @@
         </w:tc>
         <w:tc>
           <w:tcPr>
-            <w:tcW w:w="1200" w:type="dxa"/>
-          </w:tcPr>
-          <w:p>
-            <w:pPr>
-              <w:spacing w:after="60" w:line="240" w:lineRule="auto"/>
+            <w:tcW w:w="1100" w:type="dxa"/>
+            <w:vAlign w:val="center"/>
+          </w:tcPr>
+          <w:p>
+            <w:pPr>
+              <w:spacing w:before="40" w:after="40" w:line="240" w:lineRule="auto"/>
+              <w:jc w:val="center"/>
             </w:pPr>
             <w:r>
               <w:t xml:space="preserve">X</w:t>
@@ -2056,13 +2363,18 @@
         </w:tc>
       </w:tr>
       <w:tr>
-        <w:tc>
-          <w:tcPr>
-            <w:tcW w:w="3072" w:type="dxa"/>
-          </w:tcPr>
-          <w:p>
-            <w:pPr>
-              <w:spacing w:after="60" w:line="240" w:lineRule="auto"/>
+        <w:trPr>
+          <w:cantSplit/>
+        </w:trPr>
+        <w:tc>
+          <w:tcPr>
+            <w:tcW w:w="3572" w:type="dxa"/>
+            <w:vAlign w:val="center"/>
+          </w:tcPr>
+          <w:p>
+            <w:pPr>
+              <w:spacing w:before="40" w:after="40" w:line="240" w:lineRule="auto"/>
+              <w:jc w:val="left"/>
             </w:pPr>
             <w:r>
               <w:t xml:space="preserve">Penulisan tesis</w:t>
@@ -2071,11 +2383,13 @@
         </w:tc>
         <w:tc>
           <w:tcPr>
-            <w:tcW w:w="1200" w:type="dxa"/>
-          </w:tcPr>
-          <w:p>
-            <w:pPr>
-              <w:spacing w:after="60" w:line="240" w:lineRule="auto"/>
+            <w:tcW w:w="1100" w:type="dxa"/>
+            <w:vAlign w:val="center"/>
+          </w:tcPr>
+          <w:p>
+            <w:pPr>
+              <w:spacing w:before="40" w:after="40" w:line="240" w:lineRule="auto"/>
+              <w:jc w:val="center"/>
             </w:pPr>
             <w:r>
               <w:t xml:space="preserve"/>
@@ -2084,11 +2398,13 @@
         </w:tc>
         <w:tc>
           <w:tcPr>
-            <w:tcW w:w="1200" w:type="dxa"/>
-          </w:tcPr>
-          <w:p>
-            <w:pPr>
-              <w:spacing w:after="60" w:line="240" w:lineRule="auto"/>
+            <w:tcW w:w="1100" w:type="dxa"/>
+            <w:vAlign w:val="center"/>
+          </w:tcPr>
+          <w:p>
+            <w:pPr>
+              <w:spacing w:before="40" w:after="40" w:line="240" w:lineRule="auto"/>
+              <w:jc w:val="center"/>
             </w:pPr>
             <w:r>
               <w:t xml:space="preserve"/>
@@ -2097,11 +2413,13 @@
         </w:tc>
         <w:tc>
           <w:tcPr>
-            <w:tcW w:w="1200" w:type="dxa"/>
-          </w:tcPr>
-          <w:p>
-            <w:pPr>
-              <w:spacing w:after="60" w:line="240" w:lineRule="auto"/>
+            <w:tcW w:w="1100" w:type="dxa"/>
+            <w:vAlign w:val="center"/>
+          </w:tcPr>
+          <w:p>
+            <w:pPr>
+              <w:spacing w:before="40" w:after="40" w:line="240" w:lineRule="auto"/>
+              <w:jc w:val="center"/>
             </w:pPr>
             <w:r>
               <w:t xml:space="preserve"/>
@@ -2110,11 +2428,13 @@
         </w:tc>
         <w:tc>
           <w:tcPr>
-            <w:tcW w:w="1200" w:type="dxa"/>
-          </w:tcPr>
-          <w:p>
-            <w:pPr>
-              <w:spacing w:after="60" w:line="240" w:lineRule="auto"/>
+            <w:tcW w:w="1100" w:type="dxa"/>
+            <w:vAlign w:val="center"/>
+          </w:tcPr>
+          <w:p>
+            <w:pPr>
+              <w:spacing w:before="40" w:after="40" w:line="240" w:lineRule="auto"/>
+              <w:jc w:val="center"/>
             </w:pPr>
             <w:r>
               <w:t xml:space="preserve"/>
@@ -2123,11 +2443,13 @@
         </w:tc>
         <w:tc>
           <w:tcPr>
-            <w:tcW w:w="1200" w:type="dxa"/>
-          </w:tcPr>
-          <w:p>
-            <w:pPr>
-              <w:spacing w:after="60" w:line="240" w:lineRule="auto"/>
+            <w:tcW w:w="1100" w:type="dxa"/>
+            <w:vAlign w:val="center"/>
+          </w:tcPr>
+          <w:p>
+            <w:pPr>
+              <w:spacing w:before="40" w:after="40" w:line="240" w:lineRule="auto"/>
+              <w:jc w:val="center"/>
             </w:pPr>
             <w:r>
               <w:t xml:space="preserve">X</w:t>
@@ -2187,10 +2509,6 @@
     </w:sectPr>
   </w:body>
 </w:document>
-</file>
-
-<file path=word/numbering.xml><?xml version="1.0" encoding="utf-8"?>
-<w:numbering xmlns:w="http://schemas.openxmlformats.org/wordprocessingml/2006/main"/>
 </file>
 
 <file path=word/styles.xml><?xml version="1.0" encoding="utf-8"?>
@@ -2205,7 +2523,7 @@
     </w:rPrDefault>
     <w:pPrDefault>
       <w:pPr>
-        <w:spacing w:after="120" w:line="360" w:lineRule="auto"/>
+        <w:spacing w:after="200" w:line="360" w:lineRule="auto"/>
         <w:jc w:val="both"/>
       </w:pPr>
     </w:pPrDefault>
@@ -2217,7 +2535,7 @@
     <w:name w:val="Title"/>
     <w:pPr>
       <w:jc w:val="center"/>
-      <w:spacing w:after="200" w:line="276" w:lineRule="auto"/>
+      <w:spacing w:after="240" w:line="276" w:lineRule="auto"/>
     </w:pPr>
     <w:rPr>
       <w:b/>
@@ -2228,7 +2546,7 @@
   <w:style w:type="paragraph" w:styleId="Heading1">
     <w:name w:val="heading 1"/>
     <w:pPr>
-      <w:spacing w:before="360" w:after="200"/>
+      <w:spacing w:before="480" w:after="240"/>
       <w:jc w:val="left"/>
     </w:pPr>
     <w:rPr>
@@ -2240,7 +2558,7 @@
   <w:style w:type="paragraph" w:styleId="Heading2">
     <w:name w:val="heading 2"/>
     <w:pPr>
-      <w:spacing w:before="240" w:after="120"/>
+      <w:spacing w:before="360" w:after="120"/>
       <w:jc w:val="left"/>
     </w:pPr>
     <w:rPr>

</xml_diff>